<commit_message>
App v1.25.0: icone illustrate, ricerca tollerante, svuota-frigo rigoroso, foto con qualsiasi estensione; libro aggiornato
Co-Authored-By: Claude Sonnet 5.5 <noreply@anthropic.com>
Claude-Session: https://claude.ai/code/session_01ES15rN8hUF5DtAJd8EiSro
</commit_message>
<xml_diff>
--- a/ricettario.docx
+++ b/ricettario.docx
@@ -48,7 +48,7 @@
           <w:sz w:val="20"/>
           <w:szCs w:val="20"/>
         </w:rPr>
-        <w:t xml:space="preserve">Un libro di famiglia, ancora in scrittura</w:t>
+        <w:t xml:space="preserve">Un libro di famiglia</w:t>
       </w:r>
     </w:p>
     <w:p>
@@ -45111,7 +45111,7 @@
           <w:sz w:val="30"/>
           <w:szCs w:val="30"/>
         </w:rPr>
-        <w:t xml:space="preserve">5. Crostata di marmellata</w:t>
+        <w:t xml:space="preserve">5. Crostata di ricotta</w:t>
       </w:r>
     </w:p>
     <w:p>
@@ -45127,7 +45127,7 @@
           <w:sz w:val="20"/>
           <w:szCs w:val="20"/>
         </w:rPr>
-        <w:t xml:space="preserve">⏱ 1 ora (più il riposo in frigo)    ·    👥 Ingredienti per 8 persone</w:t>
+        <w:t xml:space="preserve">⏱ 1 ora e 10 minuti (più il riposo in frigo)    ·    👥 Ingredienti per 8 persone</w:t>
       </w:r>
     </w:p>
     <w:p>
@@ -45143,7 +45143,7 @@
           <w:sz w:val="22"/>
           <w:szCs w:val="22"/>
         </w:rPr>
-        <w:t xml:space="preserve">Un classico della colazione italiana: pasta frolla friabile e un cuore di marmellata.</w:t>
+        <w:t xml:space="preserve">Una crostata morbida e delicata, meno dolce di quella con la marmellata: ottima a colazione.</w:t>
       </w:r>
     </w:p>
     <w:p>
@@ -45217,7 +45217,7 @@
           <w:sz w:val="22"/>
           <w:szCs w:val="22"/>
         </w:rPr>
-        <w:t xml:space="preserve">120 g di zucchero</w:t>
+        <w:t xml:space="preserve">120 g di zucchero (per la frolla)</w:t>
       </w:r>
     </w:p>
     <w:p>
@@ -45293,7 +45293,64 @@
           <w:sz w:val="22"/>
           <w:szCs w:val="22"/>
         </w:rPr>
-        <w:t xml:space="preserve">350 g di marmellata a piacere</w:t>
+        <w:t xml:space="preserve">300 g di ricotta</w:t>
+      </w:r>
+    </w:p>
+    <w:p>
+      <w:pPr>
+        <w:pStyle w:val="ListParagraph"/>
+        <w:numPr>
+          <w:ilvl w:val="0"/>
+          <w:numId w:val="2"/>
+        </w:numPr>
+        <w:spacing w:after="70"/>
+      </w:pPr>
+      <w:r>
+        <w:rPr>
+          <w:rFonts w:ascii="Calibri" w:cs="Calibri" w:eastAsia="Calibri" w:hAnsi="Calibri"/>
+          <w:color w:val="231F1A"/>
+          <w:sz w:val="22"/>
+          <w:szCs w:val="22"/>
+        </w:rPr>
+        <w:t xml:space="preserve">80 g di zucchero (per il ripieno)</w:t>
+      </w:r>
+    </w:p>
+    <w:p>
+      <w:pPr>
+        <w:pStyle w:val="ListParagraph"/>
+        <w:numPr>
+          <w:ilvl w:val="0"/>
+          <w:numId w:val="2"/>
+        </w:numPr>
+        <w:spacing w:after="70"/>
+      </w:pPr>
+      <w:r>
+        <w:rPr>
+          <w:rFonts w:ascii="Calibri" w:cs="Calibri" w:eastAsia="Calibri" w:hAnsi="Calibri"/>
+          <w:color w:val="231F1A"/>
+          <w:sz w:val="22"/>
+          <w:szCs w:val="22"/>
+        </w:rPr>
+        <w:t xml:space="preserve">1 uovo (per il ripieno)</w:t>
+      </w:r>
+    </w:p>
+    <w:p>
+      <w:pPr>
+        <w:pStyle w:val="ListParagraph"/>
+        <w:numPr>
+          <w:ilvl w:val="0"/>
+          <w:numId w:val="2"/>
+        </w:numPr>
+        <w:spacing w:after="70"/>
+      </w:pPr>
+      <w:r>
+        <w:rPr>
+          <w:rFonts w:ascii="Calibri" w:cs="Calibri" w:eastAsia="Calibri" w:hAnsi="Calibri"/>
+          <w:color w:val="231F1A"/>
+          <w:sz w:val="22"/>
+          <w:szCs w:val="22"/>
+        </w:rPr>
+        <w:t xml:space="preserve">gocce di cioccolato (facoltative)</w:t>
       </w:r>
     </w:p>
     <w:p>
@@ -45336,7 +45393,7 @@
           <w:sz w:val="22"/>
           <w:szCs w:val="22"/>
         </w:rPr>
-        <w:t xml:space="preserve">Impastare velocemente la farina con il burro freddo a pezzetti, fino a ottenere un composto sabbioso.</w:t>
+        <w:t xml:space="preserve">Impastare velocemente la farina con il burro freddo a pezzetti, poi aggiungere lo zucchero, le uova, la scorza di limone e il sale, amalgamando il minimo indispensabile.</w:t>
       </w:r>
     </w:p>
     <w:p>
@@ -45362,7 +45419,7 @@
           <w:sz w:val="22"/>
           <w:szCs w:val="22"/>
         </w:rPr>
-        <w:t xml:space="preserve">Aggiungere lo zucchero, le uova, la scorza di limone e il sale, impastando il minimo indispensabile per amalgamare.</w:t>
+        <w:t xml:space="preserve">Formare un panetto e lasciarlo riposare in frigorifero per almeno 30 minuti.</w:t>
       </w:r>
     </w:p>
     <w:p>
@@ -45388,7 +45445,7 @@
           <w:sz w:val="22"/>
           <w:szCs w:val="22"/>
         </w:rPr>
-        <w:t xml:space="preserve">Formare un panetto, avvolgerlo nella pellicola e lasciarlo riposare in frigorifero per almeno 30 minuti.</w:t>
+        <w:t xml:space="preserve">Mescolare la ricotta con lo zucchero, l'uovo e, se piace, le gocce di cioccolato.</w:t>
       </w:r>
     </w:p>
     <w:p>
@@ -45414,7 +45471,7 @@
           <w:sz w:val="22"/>
           <w:szCs w:val="22"/>
         </w:rPr>
-        <w:t xml:space="preserve">Stendere due terzi della pasta frolla in una tortiera imburrata e infarinata, bucherellare il fondo e distribuire la marmellata.</w:t>
+        <w:t xml:space="preserve">Stendere due terzi della pasta frolla in una tortiera imburrata e infarinata e versare il ripieno di ricotta.</w:t>
       </w:r>
     </w:p>
     <w:p>
@@ -45440,7 +45497,7 @@
           <w:sz w:val="22"/>
           <w:szCs w:val="22"/>
         </w:rPr>
-        <w:t xml:space="preserve">Stendere la pasta rimasta, tagliarla a strisce e formare un reticolo sulla superficie.</w:t>
+        <w:t xml:space="preserve">Stendere la pasta rimasta a strisce e formare un reticolo sulla superficie.</w:t>
       </w:r>
     </w:p>
     <w:p>
@@ -45466,7 +45523,7 @@
           <w:sz w:val="22"/>
           <w:szCs w:val="22"/>
         </w:rPr>
-        <w:t xml:space="preserve">Cuocere in forno statico a 180°C per 30-35 minuti, finché la superficie non sarà dorata.</w:t>
+        <w:t xml:space="preserve">Cuocere in forno statico a 180°C per 35-40 minuti, finché la superficie non sarà dorata.</w:t>
       </w:r>
     </w:p>
     <w:p>
@@ -45483,7 +45540,7 @@
           <w:sz w:val="30"/>
           <w:szCs w:val="30"/>
         </w:rPr>
-        <w:t xml:space="preserve">6. Crostata di ricotta</w:t>
+        <w:t xml:space="preserve">6. Pancake alla banana</w:t>
       </w:r>
     </w:p>
     <w:p>
@@ -45499,7 +45556,7 @@
           <w:sz w:val="20"/>
           <w:szCs w:val="20"/>
         </w:rPr>
-        <w:t xml:space="preserve">⏱ 1 ora e 10 minuti (più il riposo in frigo)    ·    👥 Ingredienti per 8 persone</w:t>
+        <w:t xml:space="preserve">⏱ 25 minuti    ·    👥 Ingredienti per 4 persone</w:t>
       </w:r>
     </w:p>
     <w:p>
@@ -45515,7 +45572,7 @@
           <w:sz w:val="22"/>
           <w:szCs w:val="22"/>
         </w:rPr>
-        <w:t xml:space="preserve">Una crostata morbida e delicata, meno dolce di quella con la marmellata: ottima a colazione.</w:t>
+        <w:t xml:space="preserve">Una colazione dolce e sostanziosa, perfetta anche per un brunch del weekend.</w:t>
       </w:r>
     </w:p>
     <w:p>
@@ -45551,6 +45608,44 @@
           <w:sz w:val="22"/>
           <w:szCs w:val="22"/>
         </w:rPr>
+        <w:t xml:space="preserve">4 banane mature</w:t>
+      </w:r>
+    </w:p>
+    <w:p>
+      <w:pPr>
+        <w:pStyle w:val="ListParagraph"/>
+        <w:numPr>
+          <w:ilvl w:val="0"/>
+          <w:numId w:val="2"/>
+        </w:numPr>
+        <w:spacing w:after="70"/>
+      </w:pPr>
+      <w:r>
+        <w:rPr>
+          <w:rFonts w:ascii="Calibri" w:cs="Calibri" w:eastAsia="Calibri" w:hAnsi="Calibri"/>
+          <w:color w:val="231F1A"/>
+          <w:sz w:val="22"/>
+          <w:szCs w:val="22"/>
+        </w:rPr>
+        <w:t xml:space="preserve">4 uova</w:t>
+      </w:r>
+    </w:p>
+    <w:p>
+      <w:pPr>
+        <w:pStyle w:val="ListParagraph"/>
+        <w:numPr>
+          <w:ilvl w:val="0"/>
+          <w:numId w:val="2"/>
+        </w:numPr>
+        <w:spacing w:after="70"/>
+      </w:pPr>
+      <w:r>
+        <w:rPr>
+          <w:rFonts w:ascii="Calibri" w:cs="Calibri" w:eastAsia="Calibri" w:hAnsi="Calibri"/>
+          <w:color w:val="231F1A"/>
+          <w:sz w:val="22"/>
+          <w:szCs w:val="22"/>
+        </w:rPr>
         <w:t xml:space="preserve">300 g di farina</w:t>
       </w:r>
     </w:p>
@@ -45570,64 +45665,26 @@
           <w:sz w:val="22"/>
           <w:szCs w:val="22"/>
         </w:rPr>
-        <w:t xml:space="preserve">150 g di burro freddo</w:t>
-      </w:r>
-    </w:p>
-    <w:p>
-      <w:pPr>
-        <w:pStyle w:val="ListParagraph"/>
-        <w:numPr>
-          <w:ilvl w:val="0"/>
-          <w:numId w:val="2"/>
-        </w:numPr>
-        <w:spacing w:after="70"/>
-      </w:pPr>
-      <w:r>
-        <w:rPr>
-          <w:rFonts w:ascii="Calibri" w:cs="Calibri" w:eastAsia="Calibri" w:hAnsi="Calibri"/>
-          <w:color w:val="231F1A"/>
-          <w:sz w:val="22"/>
-          <w:szCs w:val="22"/>
-        </w:rPr>
-        <w:t xml:space="preserve">120 g di zucchero (per la frolla)</w:t>
-      </w:r>
-    </w:p>
-    <w:p>
-      <w:pPr>
-        <w:pStyle w:val="ListParagraph"/>
-        <w:numPr>
-          <w:ilvl w:val="0"/>
-          <w:numId w:val="2"/>
-        </w:numPr>
-        <w:spacing w:after="70"/>
-      </w:pPr>
-      <w:r>
-        <w:rPr>
-          <w:rFonts w:ascii="Calibri" w:cs="Calibri" w:eastAsia="Calibri" w:hAnsi="Calibri"/>
-          <w:color w:val="231F1A"/>
-          <w:sz w:val="22"/>
-          <w:szCs w:val="22"/>
-        </w:rPr>
-        <w:t xml:space="preserve">2 tuorli e 1 uovo intero</w:t>
-      </w:r>
-    </w:p>
-    <w:p>
-      <w:pPr>
-        <w:pStyle w:val="ListParagraph"/>
-        <w:numPr>
-          <w:ilvl w:val="0"/>
-          <w:numId w:val="2"/>
-        </w:numPr>
-        <w:spacing w:after="70"/>
-      </w:pPr>
-      <w:r>
-        <w:rPr>
-          <w:rFonts w:ascii="Calibri" w:cs="Calibri" w:eastAsia="Calibri" w:hAnsi="Calibri"/>
-          <w:color w:val="231F1A"/>
-          <w:sz w:val="22"/>
-          <w:szCs w:val="22"/>
-        </w:rPr>
-        <w:t xml:space="preserve">scorza di 1 limone</w:t>
+        <w:t xml:space="preserve">240 ml di latte</w:t>
+      </w:r>
+    </w:p>
+    <w:p>
+      <w:pPr>
+        <w:pStyle w:val="ListParagraph"/>
+        <w:numPr>
+          <w:ilvl w:val="0"/>
+          <w:numId w:val="2"/>
+        </w:numPr>
+        <w:spacing w:after="70"/>
+      </w:pPr>
+      <w:r>
+        <w:rPr>
+          <w:rFonts w:ascii="Calibri" w:cs="Calibri" w:eastAsia="Calibri" w:hAnsi="Calibri"/>
+          <w:color w:val="231F1A"/>
+          <w:sz w:val="22"/>
+          <w:szCs w:val="22"/>
+        </w:rPr>
+        <w:t xml:space="preserve">1 bustina di lievito per dolci</w:t>
       </w:r>
     </w:p>
     <w:p>
@@ -45647,82 +45704,6 @@
           <w:szCs w:val="22"/>
         </w:rPr>
         <w:t xml:space="preserve">un pizzico di sale</w:t>
-      </w:r>
-    </w:p>
-    <w:p>
-      <w:pPr>
-        <w:pStyle w:val="ListParagraph"/>
-        <w:numPr>
-          <w:ilvl w:val="0"/>
-          <w:numId w:val="2"/>
-        </w:numPr>
-        <w:spacing w:after="70"/>
-      </w:pPr>
-      <w:r>
-        <w:rPr>
-          <w:rFonts w:ascii="Calibri" w:cs="Calibri" w:eastAsia="Calibri" w:hAnsi="Calibri"/>
-          <w:color w:val="231F1A"/>
-          <w:sz w:val="22"/>
-          <w:szCs w:val="22"/>
-        </w:rPr>
-        <w:t xml:space="preserve">300 g di ricotta</w:t>
-      </w:r>
-    </w:p>
-    <w:p>
-      <w:pPr>
-        <w:pStyle w:val="ListParagraph"/>
-        <w:numPr>
-          <w:ilvl w:val="0"/>
-          <w:numId w:val="2"/>
-        </w:numPr>
-        <w:spacing w:after="70"/>
-      </w:pPr>
-      <w:r>
-        <w:rPr>
-          <w:rFonts w:ascii="Calibri" w:cs="Calibri" w:eastAsia="Calibri" w:hAnsi="Calibri"/>
-          <w:color w:val="231F1A"/>
-          <w:sz w:val="22"/>
-          <w:szCs w:val="22"/>
-        </w:rPr>
-        <w:t xml:space="preserve">80 g di zucchero (per il ripieno)</w:t>
-      </w:r>
-    </w:p>
-    <w:p>
-      <w:pPr>
-        <w:pStyle w:val="ListParagraph"/>
-        <w:numPr>
-          <w:ilvl w:val="0"/>
-          <w:numId w:val="2"/>
-        </w:numPr>
-        <w:spacing w:after="70"/>
-      </w:pPr>
-      <w:r>
-        <w:rPr>
-          <w:rFonts w:ascii="Calibri" w:cs="Calibri" w:eastAsia="Calibri" w:hAnsi="Calibri"/>
-          <w:color w:val="231F1A"/>
-          <w:sz w:val="22"/>
-          <w:szCs w:val="22"/>
-        </w:rPr>
-        <w:t xml:space="preserve">1 uovo (per il ripieno)</w:t>
-      </w:r>
-    </w:p>
-    <w:p>
-      <w:pPr>
-        <w:pStyle w:val="ListParagraph"/>
-        <w:numPr>
-          <w:ilvl w:val="0"/>
-          <w:numId w:val="2"/>
-        </w:numPr>
-        <w:spacing w:after="70"/>
-      </w:pPr>
-      <w:r>
-        <w:rPr>
-          <w:rFonts w:ascii="Calibri" w:cs="Calibri" w:eastAsia="Calibri" w:hAnsi="Calibri"/>
-          <w:color w:val="231F1A"/>
-          <w:sz w:val="22"/>
-          <w:szCs w:val="22"/>
-        </w:rPr>
-        <w:t xml:space="preserve">gocce di cioccolato (facoltative)</w:t>
       </w:r>
     </w:p>
     <w:p>
@@ -45765,7 +45746,7 @@
           <w:sz w:val="22"/>
           <w:szCs w:val="22"/>
         </w:rPr>
-        <w:t xml:space="preserve">Impastare velocemente la farina con il burro freddo a pezzetti, poi aggiungere lo zucchero, le uova, la scorza di limone e il sale, amalgamando il minimo indispensabile.</w:t>
+        <w:t xml:space="preserve">Schiacciare le banane con una forchetta fino a ottenere una purea.</w:t>
       </w:r>
     </w:p>
     <w:p>
@@ -45791,7 +45772,7 @@
           <w:sz w:val="22"/>
           <w:szCs w:val="22"/>
         </w:rPr>
-        <w:t xml:space="preserve">Formare un panetto e lasciarlo riposare in frigorifero per almeno 30 minuti.</w:t>
+        <w:t xml:space="preserve">Aggiungere le uova e mescolare bene.</w:t>
       </w:r>
     </w:p>
     <w:p>
@@ -45817,7 +45798,7 @@
           <w:sz w:val="22"/>
           <w:szCs w:val="22"/>
         </w:rPr>
-        <w:t xml:space="preserve">Mescolare la ricotta con lo zucchero, l'uovo e, se piace, le gocce di cioccolato.</w:t>
+        <w:t xml:space="preserve">Versare il latte, unire la farina, il lievito e un pizzico di sale, mescolando fino a ottenere un composto omogeneo e senza grumi.</w:t>
       </w:r>
     </w:p>
     <w:p>
@@ -45843,7 +45824,7 @@
           <w:sz w:val="22"/>
           <w:szCs w:val="22"/>
         </w:rPr>
-        <w:t xml:space="preserve">Stendere due terzi della pasta frolla in una tortiera imburrata e infarinata e versare il ripieno di ricotta.</w:t>
+        <w:t xml:space="preserve">Scaldare una padella antiaderente e versare un mestolo di composto per ogni pancake; cuocere 2-3 minuti per lato, finché non si formano bollicine in superficie, poi girare.</w:t>
       </w:r>
     </w:p>
     <w:p>
@@ -45869,33 +45850,7 @@
           <w:sz w:val="22"/>
           <w:szCs w:val="22"/>
         </w:rPr>
-        <w:t xml:space="preserve">Stendere la pasta rimasta a strisce e formare un reticolo sulla superficie.</w:t>
-      </w:r>
-    </w:p>
-    <w:p>
-      <w:pPr>
-        <w:spacing w:after="130" w:line="300"/>
-        <w:ind w:left="460" w:hanging="460"/>
-      </w:pPr>
-      <w:r>
-        <w:rPr>
-          <w:rFonts w:ascii="Calibri" w:cs="Calibri" w:eastAsia="Calibri" w:hAnsi="Calibri"/>
-          <w:b/>
-          <w:bCs/>
-          <w:color w:val="A6741F"/>
-          <w:sz w:val="22"/>
-          <w:szCs w:val="22"/>
-        </w:rPr>
-        <w:t xml:space="preserve">6.  </w:t>
-      </w:r>
-      <w:r>
-        <w:rPr>
-          <w:rFonts w:ascii="Calibri" w:cs="Calibri" w:eastAsia="Calibri" w:hAnsi="Calibri"/>
-          <w:color w:val="231F1A"/>
-          <w:sz w:val="22"/>
-          <w:szCs w:val="22"/>
-        </w:rPr>
-        <w:t xml:space="preserve">Cuocere in forno statico a 180°C per 35-40 minuti, finché la superficie non sarà dorata.</w:t>
+        <w:t xml:space="preserve">Servire caldi, anche con miele, sciroppo d'acero o frutta fresca.</w:t>
       </w:r>
     </w:p>
     <w:p>
@@ -45912,7 +45867,7 @@
           <w:sz w:val="30"/>
           <w:szCs w:val="30"/>
         </w:rPr>
-        <w:t xml:space="preserve">7. Pancake alla banana</w:t>
+        <w:t xml:space="preserve">7. Panna cotta</w:t>
       </w:r>
     </w:p>
     <w:p>
@@ -45928,7 +45883,7 @@
           <w:sz w:val="20"/>
           <w:szCs w:val="20"/>
         </w:rPr>
-        <w:t xml:space="preserve">⏱ 25 minuti    ·    👥 Ingredienti per 4 persone</w:t>
+        <w:t xml:space="preserve">⏱ 20 minuti (più il riposo in frigo)    ·    👥 Ingredienti per 2 persone</w:t>
       </w:r>
     </w:p>
     <w:p>
@@ -45944,7 +45899,7 @@
           <w:sz w:val="22"/>
           <w:szCs w:val="22"/>
         </w:rPr>
-        <w:t xml:space="preserve">Una colazione dolce e sostanziosa, perfetta anche per un brunch del weekend.</w:t>
+        <w:t xml:space="preserve">Un dolce al cucchiaio elegante e velocissimo da preparare, perfetto anche il giorno prima.</w:t>
       </w:r>
     </w:p>
     <w:p>
@@ -45980,102 +45935,83 @@
           <w:sz w:val="22"/>
           <w:szCs w:val="22"/>
         </w:rPr>
-        <w:t xml:space="preserve">4 banane mature</w:t>
-      </w:r>
-    </w:p>
-    <w:p>
-      <w:pPr>
-        <w:pStyle w:val="ListParagraph"/>
-        <w:numPr>
-          <w:ilvl w:val="0"/>
-          <w:numId w:val="2"/>
-        </w:numPr>
-        <w:spacing w:after="70"/>
-      </w:pPr>
-      <w:r>
-        <w:rPr>
-          <w:rFonts w:ascii="Calibri" w:cs="Calibri" w:eastAsia="Calibri" w:hAnsi="Calibri"/>
-          <w:color w:val="231F1A"/>
-          <w:sz w:val="22"/>
-          <w:szCs w:val="22"/>
-        </w:rPr>
-        <w:t xml:space="preserve">4 uova</w:t>
-      </w:r>
-    </w:p>
-    <w:p>
-      <w:pPr>
-        <w:pStyle w:val="ListParagraph"/>
-        <w:numPr>
-          <w:ilvl w:val="0"/>
-          <w:numId w:val="2"/>
-        </w:numPr>
-        <w:spacing w:after="70"/>
-      </w:pPr>
-      <w:r>
-        <w:rPr>
-          <w:rFonts w:ascii="Calibri" w:cs="Calibri" w:eastAsia="Calibri" w:hAnsi="Calibri"/>
-          <w:color w:val="231F1A"/>
-          <w:sz w:val="22"/>
-          <w:szCs w:val="22"/>
-        </w:rPr>
-        <w:t xml:space="preserve">300 g di farina</w:t>
-      </w:r>
-    </w:p>
-    <w:p>
-      <w:pPr>
-        <w:pStyle w:val="ListParagraph"/>
-        <w:numPr>
-          <w:ilvl w:val="0"/>
-          <w:numId w:val="2"/>
-        </w:numPr>
-        <w:spacing w:after="70"/>
-      </w:pPr>
-      <w:r>
-        <w:rPr>
-          <w:rFonts w:ascii="Calibri" w:cs="Calibri" w:eastAsia="Calibri" w:hAnsi="Calibri"/>
-          <w:color w:val="231F1A"/>
-          <w:sz w:val="22"/>
-          <w:szCs w:val="22"/>
-        </w:rPr>
-        <w:t xml:space="preserve">240 ml di latte</w:t>
-      </w:r>
-    </w:p>
-    <w:p>
-      <w:pPr>
-        <w:pStyle w:val="ListParagraph"/>
-        <w:numPr>
-          <w:ilvl w:val="0"/>
-          <w:numId w:val="2"/>
-        </w:numPr>
-        <w:spacing w:after="70"/>
-      </w:pPr>
-      <w:r>
-        <w:rPr>
-          <w:rFonts w:ascii="Calibri" w:cs="Calibri" w:eastAsia="Calibri" w:hAnsi="Calibri"/>
-          <w:color w:val="231F1A"/>
-          <w:sz w:val="22"/>
-          <w:szCs w:val="22"/>
-        </w:rPr>
-        <w:t xml:space="preserve">1 bustina di lievito per dolci</w:t>
-      </w:r>
-    </w:p>
-    <w:p>
-      <w:pPr>
-        <w:pStyle w:val="ListParagraph"/>
-        <w:numPr>
-          <w:ilvl w:val="0"/>
-          <w:numId w:val="2"/>
-        </w:numPr>
-        <w:spacing w:after="70"/>
-      </w:pPr>
-      <w:r>
-        <w:rPr>
-          <w:rFonts w:ascii="Calibri" w:cs="Calibri" w:eastAsia="Calibri" w:hAnsi="Calibri"/>
-          <w:color w:val="231F1A"/>
-          <w:sz w:val="22"/>
-          <w:szCs w:val="22"/>
-        </w:rPr>
-        <w:t xml:space="preserve">un pizzico di sale</w:t>
+        <w:t xml:space="preserve">500 ml di panna fresca</w:t>
+      </w:r>
+    </w:p>
+    <w:p>
+      <w:pPr>
+        <w:pStyle w:val="ListParagraph"/>
+        <w:numPr>
+          <w:ilvl w:val="0"/>
+          <w:numId w:val="2"/>
+        </w:numPr>
+        <w:spacing w:after="70"/>
+      </w:pPr>
+      <w:r>
+        <w:rPr>
+          <w:rFonts w:ascii="Calibri" w:cs="Calibri" w:eastAsia="Calibri" w:hAnsi="Calibri"/>
+          <w:color w:val="231F1A"/>
+          <w:sz w:val="22"/>
+          <w:szCs w:val="22"/>
+        </w:rPr>
+        <w:t xml:space="preserve">100 g di zucchero</w:t>
+      </w:r>
+    </w:p>
+    <w:p>
+      <w:pPr>
+        <w:pStyle w:val="ListParagraph"/>
+        <w:numPr>
+          <w:ilvl w:val="0"/>
+          <w:numId w:val="2"/>
+        </w:numPr>
+        <w:spacing w:after="70"/>
+      </w:pPr>
+      <w:r>
+        <w:rPr>
+          <w:rFonts w:ascii="Calibri" w:cs="Calibri" w:eastAsia="Calibri" w:hAnsi="Calibri"/>
+          <w:color w:val="231F1A"/>
+          <w:sz w:val="22"/>
+          <w:szCs w:val="22"/>
+        </w:rPr>
+        <w:t xml:space="preserve">1 bustina di gelatina in fogli (colla di pesce)</w:t>
+      </w:r>
+    </w:p>
+    <w:p>
+      <w:pPr>
+        <w:pStyle w:val="ListParagraph"/>
+        <w:numPr>
+          <w:ilvl w:val="0"/>
+          <w:numId w:val="2"/>
+        </w:numPr>
+        <w:spacing w:after="70"/>
+      </w:pPr>
+      <w:r>
+        <w:rPr>
+          <w:rFonts w:ascii="Calibri" w:cs="Calibri" w:eastAsia="Calibri" w:hAnsi="Calibri"/>
+          <w:color w:val="231F1A"/>
+          <w:sz w:val="22"/>
+          <w:szCs w:val="22"/>
+        </w:rPr>
+        <w:t xml:space="preserve">1 bacca di vaniglia (o estratto)</w:t>
+      </w:r>
+    </w:p>
+    <w:p>
+      <w:pPr>
+        <w:pStyle w:val="ListParagraph"/>
+        <w:numPr>
+          <w:ilvl w:val="0"/>
+          <w:numId w:val="2"/>
+        </w:numPr>
+        <w:spacing w:after="70"/>
+      </w:pPr>
+      <w:r>
+        <w:rPr>
+          <w:rFonts w:ascii="Calibri" w:cs="Calibri" w:eastAsia="Calibri" w:hAnsi="Calibri"/>
+          <w:color w:val="231F1A"/>
+          <w:sz w:val="22"/>
+          <w:szCs w:val="22"/>
+        </w:rPr>
+        <w:t xml:space="preserve">frutti di bosco o caramello per accompagnare</w:t>
       </w:r>
     </w:p>
     <w:p>
@@ -46118,7 +46054,7 @@
           <w:sz w:val="22"/>
           <w:szCs w:val="22"/>
         </w:rPr>
-        <w:t xml:space="preserve">Schiacciare le banane con una forchetta fino a ottenere una purea.</w:t>
+        <w:t xml:space="preserve">Mettere i fogli di gelatina in ammollo in acqua fredda per 10 minuti.</w:t>
       </w:r>
     </w:p>
     <w:p>
@@ -46144,7 +46080,7 @@
           <w:sz w:val="22"/>
           <w:szCs w:val="22"/>
         </w:rPr>
-        <w:t xml:space="preserve">Aggiungere le uova e mescolare bene.</w:t>
+        <w:t xml:space="preserve">Scaldare la panna con lo zucchero e i semi di vaniglia, senza farla bollire.</w:t>
       </w:r>
     </w:p>
     <w:p>
@@ -46170,7 +46106,7 @@
           <w:sz w:val="22"/>
           <w:szCs w:val="22"/>
         </w:rPr>
-        <w:t xml:space="preserve">Versare il latte, unire la farina, il lievito e un pizzico di sale, mescolando fino a ottenere un composto omogeneo e senza grumi.</w:t>
+        <w:t xml:space="preserve">Strizzare la gelatina e scioglierla nella panna calda, mescolando bene finché non sarà ben amalgamata.</w:t>
       </w:r>
     </w:p>
     <w:p>
@@ -46196,7 +46132,7 @@
           <w:sz w:val="22"/>
           <w:szCs w:val="22"/>
         </w:rPr>
-        <w:t xml:space="preserve">Scaldare una padella antiaderente e versare un mestolo di composto per ogni pancake; cuocere 2-3 minuti per lato, finché non si formano bollicine in superficie, poi girare.</w:t>
+        <w:t xml:space="preserve">Versare nelle coppette e lasciar raffreddare a temperatura ambiente, poi in frigorifero per almeno 4 ore.</w:t>
       </w:r>
     </w:p>
     <w:p>
@@ -46222,7 +46158,7 @@
           <w:sz w:val="22"/>
           <w:szCs w:val="22"/>
         </w:rPr>
-        <w:t xml:space="preserve">Servire caldi, anche con miele, sciroppo d'acero o frutta fresca.</w:t>
+        <w:t xml:space="preserve">Servire con frutti di bosco freschi o una colata di caramello.</w:t>
       </w:r>
     </w:p>
     <w:p>
@@ -46239,7 +46175,7 @@
           <w:sz w:val="30"/>
           <w:szCs w:val="30"/>
         </w:rPr>
-        <w:t xml:space="preserve">8. Panna cotta</w:t>
+        <w:t xml:space="preserve">8. Pasta frolla per mezzelune o crostata</w:t>
       </w:r>
     </w:p>
     <w:p>
@@ -46255,7 +46191,7 @@
           <w:sz w:val="20"/>
           <w:szCs w:val="20"/>
         </w:rPr>
-        <w:t xml:space="preserve">⏱ 20 minuti (più il riposo in frigo)    ·    👥 Ingredienti per 2 persone</w:t>
+        <w:t xml:space="preserve">⏱ 1 ora (più il riposo in frigo)    ·    👥 Ingredienti per circa 20 mezzelune (o una crostata)</w:t>
       </w:r>
     </w:p>
     <w:p>
@@ -46271,7 +46207,7 @@
           <w:sz w:val="22"/>
           <w:szCs w:val="22"/>
         </w:rPr>
-        <w:t xml:space="preserve">Un dolce al cucchiaio elegante e velocissimo da preparare, perfetto anche il giorno prima.</w:t>
+        <w:t xml:space="preserve">Un impasto base versatile: lo stesso procedimento serve sia per delle mezzelune ripiene da inzuppare nel latte, sia per una classica crostata con marmellata.</w:t>
       </w:r>
     </w:p>
     <w:p>
@@ -46307,83 +46243,140 @@
           <w:sz w:val="22"/>
           <w:szCs w:val="22"/>
         </w:rPr>
-        <w:t xml:space="preserve">500 ml di panna fresca</w:t>
-      </w:r>
-    </w:p>
-    <w:p>
-      <w:pPr>
-        <w:pStyle w:val="ListParagraph"/>
-        <w:numPr>
-          <w:ilvl w:val="0"/>
-          <w:numId w:val="2"/>
-        </w:numPr>
-        <w:spacing w:after="70"/>
-      </w:pPr>
-      <w:r>
-        <w:rPr>
-          <w:rFonts w:ascii="Calibri" w:cs="Calibri" w:eastAsia="Calibri" w:hAnsi="Calibri"/>
-          <w:color w:val="231F1A"/>
-          <w:sz w:val="22"/>
-          <w:szCs w:val="22"/>
-        </w:rPr>
-        <w:t xml:space="preserve">100 g di zucchero</w:t>
-      </w:r>
-    </w:p>
-    <w:p>
-      <w:pPr>
-        <w:pStyle w:val="ListParagraph"/>
-        <w:numPr>
-          <w:ilvl w:val="0"/>
-          <w:numId w:val="2"/>
-        </w:numPr>
-        <w:spacing w:after="70"/>
-      </w:pPr>
-      <w:r>
-        <w:rPr>
-          <w:rFonts w:ascii="Calibri" w:cs="Calibri" w:eastAsia="Calibri" w:hAnsi="Calibri"/>
-          <w:color w:val="231F1A"/>
-          <w:sz w:val="22"/>
-          <w:szCs w:val="22"/>
-        </w:rPr>
-        <w:t xml:space="preserve">1 bustina di gelatina in fogli (colla di pesce)</w:t>
-      </w:r>
-    </w:p>
-    <w:p>
-      <w:pPr>
-        <w:pStyle w:val="ListParagraph"/>
-        <w:numPr>
-          <w:ilvl w:val="0"/>
-          <w:numId w:val="2"/>
-        </w:numPr>
-        <w:spacing w:after="70"/>
-      </w:pPr>
-      <w:r>
-        <w:rPr>
-          <w:rFonts w:ascii="Calibri" w:cs="Calibri" w:eastAsia="Calibri" w:hAnsi="Calibri"/>
-          <w:color w:val="231F1A"/>
-          <w:sz w:val="22"/>
-          <w:szCs w:val="22"/>
-        </w:rPr>
-        <w:t xml:space="preserve">1 bacca di vaniglia (o estratto)</w:t>
-      </w:r>
-    </w:p>
-    <w:p>
-      <w:pPr>
-        <w:pStyle w:val="ListParagraph"/>
-        <w:numPr>
-          <w:ilvl w:val="0"/>
-          <w:numId w:val="2"/>
-        </w:numPr>
-        <w:spacing w:after="70"/>
-      </w:pPr>
-      <w:r>
-        <w:rPr>
-          <w:rFonts w:ascii="Calibri" w:cs="Calibri" w:eastAsia="Calibri" w:hAnsi="Calibri"/>
-          <w:color w:val="231F1A"/>
-          <w:sz w:val="22"/>
-          <w:szCs w:val="22"/>
-        </w:rPr>
-        <w:t xml:space="preserve">frutti di bosco o caramello per accompagnare</w:t>
+        <w:t xml:space="preserve">1 uovo</w:t>
+      </w:r>
+    </w:p>
+    <w:p>
+      <w:pPr>
+        <w:pStyle w:val="ListParagraph"/>
+        <w:numPr>
+          <w:ilvl w:val="0"/>
+          <w:numId w:val="2"/>
+        </w:numPr>
+        <w:spacing w:after="70"/>
+      </w:pPr>
+      <w:r>
+        <w:rPr>
+          <w:rFonts w:ascii="Calibri" w:cs="Calibri" w:eastAsia="Calibri" w:hAnsi="Calibri"/>
+          <w:color w:val="231F1A"/>
+          <w:sz w:val="22"/>
+          <w:szCs w:val="22"/>
+        </w:rPr>
+        <w:t xml:space="preserve">125 g di zucchero</w:t>
+      </w:r>
+    </w:p>
+    <w:p>
+      <w:pPr>
+        <w:pStyle w:val="ListParagraph"/>
+        <w:numPr>
+          <w:ilvl w:val="0"/>
+          <w:numId w:val="2"/>
+        </w:numPr>
+        <w:spacing w:after="70"/>
+      </w:pPr>
+      <w:r>
+        <w:rPr>
+          <w:rFonts w:ascii="Calibri" w:cs="Calibri" w:eastAsia="Calibri" w:hAnsi="Calibri"/>
+          <w:color w:val="231F1A"/>
+          <w:sz w:val="22"/>
+          <w:szCs w:val="22"/>
+        </w:rPr>
+        <w:t xml:space="preserve">un pizzico di sale</w:t>
+      </w:r>
+    </w:p>
+    <w:p>
+      <w:pPr>
+        <w:pStyle w:val="ListParagraph"/>
+        <w:numPr>
+          <w:ilvl w:val="0"/>
+          <w:numId w:val="2"/>
+        </w:numPr>
+        <w:spacing w:after="70"/>
+      </w:pPr>
+      <w:r>
+        <w:rPr>
+          <w:rFonts w:ascii="Calibri" w:cs="Calibri" w:eastAsia="Calibri" w:hAnsi="Calibri"/>
+          <w:color w:val="231F1A"/>
+          <w:sz w:val="22"/>
+          <w:szCs w:val="22"/>
+        </w:rPr>
+        <w:t xml:space="preserve">250 g di farina 00</w:t>
+      </w:r>
+    </w:p>
+    <w:p>
+      <w:pPr>
+        <w:pStyle w:val="ListParagraph"/>
+        <w:numPr>
+          <w:ilvl w:val="0"/>
+          <w:numId w:val="2"/>
+        </w:numPr>
+        <w:spacing w:after="70"/>
+      </w:pPr>
+      <w:r>
+        <w:rPr>
+          <w:rFonts w:ascii="Calibri" w:cs="Calibri" w:eastAsia="Calibri" w:hAnsi="Calibri"/>
+          <w:color w:val="231F1A"/>
+          <w:sz w:val="22"/>
+          <w:szCs w:val="22"/>
+        </w:rPr>
+        <w:t xml:space="preserve">vanillina</w:t>
+      </w:r>
+    </w:p>
+    <w:p>
+      <w:pPr>
+        <w:pStyle w:val="ListParagraph"/>
+        <w:numPr>
+          <w:ilvl w:val="0"/>
+          <w:numId w:val="2"/>
+        </w:numPr>
+        <w:spacing w:after="70"/>
+      </w:pPr>
+      <w:r>
+        <w:rPr>
+          <w:rFonts w:ascii="Calibri" w:cs="Calibri" w:eastAsia="Calibri" w:hAnsi="Calibri"/>
+          <w:color w:val="231F1A"/>
+          <w:sz w:val="22"/>
+          <w:szCs w:val="22"/>
+        </w:rPr>
+        <w:t xml:space="preserve">100-125 g di burro a temperatura ambiente</w:t>
+      </w:r>
+    </w:p>
+    <w:p>
+      <w:pPr>
+        <w:pStyle w:val="ListParagraph"/>
+        <w:numPr>
+          <w:ilvl w:val="0"/>
+          <w:numId w:val="2"/>
+        </w:numPr>
+        <w:spacing w:after="70"/>
+      </w:pPr>
+      <w:r>
+        <w:rPr>
+          <w:rFonts w:ascii="Calibri" w:cs="Calibri" w:eastAsia="Calibri" w:hAnsi="Calibri"/>
+          <w:color w:val="231F1A"/>
+          <w:sz w:val="22"/>
+          <w:szCs w:val="22"/>
+        </w:rPr>
+        <w:t xml:space="preserve">1 cucchiaino e mezzo di lievito per dolci</w:t>
+      </w:r>
+    </w:p>
+    <w:p>
+      <w:pPr>
+        <w:pStyle w:val="ListParagraph"/>
+        <w:numPr>
+          <w:ilvl w:val="0"/>
+          <w:numId w:val="2"/>
+        </w:numPr>
+        <w:spacing w:after="70"/>
+      </w:pPr>
+      <w:r>
+        <w:rPr>
+          <w:rFonts w:ascii="Calibri" w:cs="Calibri" w:eastAsia="Calibri" w:hAnsi="Calibri"/>
+          <w:color w:val="231F1A"/>
+          <w:sz w:val="22"/>
+          <w:szCs w:val="22"/>
+        </w:rPr>
+        <w:t xml:space="preserve">marmellata o crema di cioccolato per farcire</w:t>
       </w:r>
     </w:p>
     <w:p>
@@ -46426,7 +46419,7 @@
           <w:sz w:val="22"/>
           <w:szCs w:val="22"/>
         </w:rPr>
-        <w:t xml:space="preserve">Mettere i fogli di gelatina in ammollo in acqua fredda per 10 minuti.</w:t>
+        <w:t xml:space="preserve">Mescolare con una frusta l'uovo, lo zucchero e il pizzico di sale.</w:t>
       </w:r>
     </w:p>
     <w:p>
@@ -46452,7 +46445,7 @@
           <w:sz w:val="22"/>
           <w:szCs w:val="22"/>
         </w:rPr>
-        <w:t xml:space="preserve">Scaldare la panna con lo zucchero e i semi di vaniglia, senza farla bollire.</w:t>
+        <w:t xml:space="preserve">Setacciare insieme la farina, la vanillina e il lievito, poi unirli al composto mescolando un po' con un cucchiaio.</w:t>
       </w:r>
     </w:p>
     <w:p>
@@ -46478,7 +46471,7 @@
           <w:sz w:val="22"/>
           <w:szCs w:val="22"/>
         </w:rPr>
-        <w:t xml:space="preserve">Strizzare la gelatina e scioglierla nella panna calda, mescolando bene finché non sarà ben amalgamata.</w:t>
+        <w:t xml:space="preserve">Aggiungere il burro a pezzi e amalgamare con le mani fino a ottenere un composto omogeneo.</w:t>
       </w:r>
     </w:p>
     <w:p>
@@ -46504,7 +46497,7 @@
           <w:sz w:val="22"/>
           <w:szCs w:val="22"/>
         </w:rPr>
-        <w:t xml:space="preserve">Versare nelle coppette e lasciar raffreddare a temperatura ambiente, poi in frigorifero per almeno 4 ore.</w:t>
+        <w:t xml:space="preserve">Formare una palla, avvolgerla e lasciarla riposare in frigorifero per 30 minuti.</w:t>
       </w:r>
     </w:p>
     <w:p>
@@ -46530,7 +46523,91 @@
           <w:sz w:val="22"/>
           <w:szCs w:val="22"/>
         </w:rPr>
-        <w:t xml:space="preserve">Servire con frutti di bosco freschi o una colata di caramello.</w:t>
+        <w:t xml:space="preserve">Stendere l'impasto con il mattarello a circa mezzo centimetro di spessore e ricavare dei cerchi con uno stampo.</w:t>
+      </w:r>
+    </w:p>
+    <w:p>
+      <w:pPr>
+        <w:spacing w:after="130" w:line="300"/>
+        <w:ind w:left="460" w:hanging="460"/>
+      </w:pPr>
+      <w:r>
+        <w:rPr>
+          <w:rFonts w:ascii="Calibri" w:cs="Calibri" w:eastAsia="Calibri" w:hAnsi="Calibri"/>
+          <w:b/>
+          <w:bCs/>
+          <w:color w:val="A6741F"/>
+          <w:sz w:val="22"/>
+          <w:szCs w:val="22"/>
+        </w:rPr>
+        <w:t xml:space="preserve">6.  </w:t>
+      </w:r>
+      <w:r>
+        <w:rPr>
+          <w:rFonts w:ascii="Calibri" w:cs="Calibri" w:eastAsia="Calibri" w:hAnsi="Calibri"/>
+          <w:color w:val="231F1A"/>
+          <w:sz w:val="22"/>
+          <w:szCs w:val="22"/>
+        </w:rPr>
+        <w:t xml:space="preserve">Mettere un po' di marmellata o cioccolata al centro di ogni cerchio, chiudere a mezzaluna e disporre su una teglia foderata di carta forno.</w:t>
+      </w:r>
+    </w:p>
+    <w:p>
+      <w:pPr>
+        <w:spacing w:after="130" w:line="300"/>
+        <w:ind w:left="460" w:hanging="460"/>
+      </w:pPr>
+      <w:r>
+        <w:rPr>
+          <w:rFonts w:ascii="Calibri" w:cs="Calibri" w:eastAsia="Calibri" w:hAnsi="Calibri"/>
+          <w:b/>
+          <w:bCs/>
+          <w:color w:val="A6741F"/>
+          <w:sz w:val="22"/>
+          <w:szCs w:val="22"/>
+        </w:rPr>
+        <w:t xml:space="preserve">7.  </w:t>
+      </w:r>
+      <w:r>
+        <w:rPr>
+          <w:rFonts w:ascii="Calibri" w:cs="Calibri" w:eastAsia="Calibri" w:hAnsi="Calibri"/>
+          <w:color w:val="231F1A"/>
+          <w:sz w:val="22"/>
+          <w:szCs w:val="22"/>
+        </w:rPr>
+        <w:t xml:space="preserve">Cuocere in forno statico, in posizione centrale, a 180°C per 20-25 minuti, finché non saranno dorate (attenzione a non farle scurire troppo).</w:t>
+      </w:r>
+    </w:p>
+    <w:p>
+      <w:pPr>
+        <w:spacing w:after="60" w:before="140"/>
+      </w:pPr>
+      <w:r>
+        <w:rPr>
+          <w:rFonts w:ascii="Calibri" w:cs="Calibri" w:eastAsia="Calibri" w:hAnsi="Calibri"/>
+          <w:b/>
+          <w:bCs/>
+          <w:i/>
+          <w:iCs/>
+          <w:color w:val="2E3820"/>
+          <w:sz w:val="21"/>
+          <w:szCs w:val="21"/>
+        </w:rPr>
+        <w:t xml:space="preserve">Variante crostata</w:t>
+      </w:r>
+    </w:p>
+    <w:p>
+      <w:pPr>
+        <w:spacing w:after="80" w:line="280"/>
+      </w:pPr>
+      <w:r>
+        <w:rPr>
+          <w:rFonts w:ascii="Calibri" w:cs="Calibri" w:eastAsia="Calibri" w:hAnsi="Calibri"/>
+          <w:color w:val="333029"/>
+          <w:sz w:val="21"/>
+          <w:szCs w:val="21"/>
+        </w:rPr>
+        <w:t xml:space="preserve">Al posto delle mezzelune: prendere dal frigo 2/3 dell'impasto e stenderlo con le mani direttamente in una teglia foderata di carta forno. Farcire con marmellata (o crema di cioccolato). Con la pasta restante formare delle striscioline e disporle sopra a reticolo. Cuocere in forno statico, a metà altezza, a 180°C per 30-40 minuti, controllando che la superficie non scurisca troppo: deve risultare appena dorata.</w:t>
       </w:r>
     </w:p>
     <w:p>

</xml_diff>